<commit_message>
actividad del 6 de octubre
</commit_message>
<xml_diff>
--- a/documentos/practica_30_septiembre.docx
+++ b/documentos/practica_30_septiembre.docx
@@ -34,7 +34,15 @@
           </w:tcPr>
           <w:p>
             <w:r>
-              <w:t>Obtener la lista de todas las VLANs configuradas en un switch</w:t>
+              <w:t xml:space="preserve">Obtener la lista de todas las </w:t>
+            </w:r>
+            <w:proofErr w:type="spellStart"/>
+            <w:r>
+              <w:t>VLANs</w:t>
+            </w:r>
+            <w:proofErr w:type="spellEnd"/>
+            <w:r>
+              <w:t xml:space="preserve"> configuradas en un switch</w:t>
             </w:r>
           </w:p>
         </w:tc>
@@ -44,7 +52,23 @@
           </w:tcPr>
           <w:p>
             <w:r>
-              <w:t>El get por que para eso se utiliza</w:t>
+              <w:t xml:space="preserve">El </w:t>
+            </w:r>
+            <w:proofErr w:type="spellStart"/>
+            <w:r>
+              <w:t>get</w:t>
+            </w:r>
+            <w:proofErr w:type="spellEnd"/>
+            <w:r>
+              <w:t xml:space="preserve"> </w:t>
+            </w:r>
+            <w:proofErr w:type="spellStart"/>
+            <w:r>
+              <w:t>por que</w:t>
+            </w:r>
+            <w:proofErr w:type="spellEnd"/>
+            <w:r>
+              <w:t xml:space="preserve"> para eso se utiliza</w:t>
             </w:r>
           </w:p>
         </w:tc>
@@ -56,7 +80,15 @@
           </w:tcPr>
           <w:p>
             <w:r>
-              <w:t>Crear un nuevo objeto de red (Network Object) en un firewall.</w:t>
+              <w:t xml:space="preserve">Crear un nuevo objeto de red (Network </w:t>
+            </w:r>
+            <w:proofErr w:type="spellStart"/>
+            <w:r>
+              <w:t>Object</w:t>
+            </w:r>
+            <w:proofErr w:type="spellEnd"/>
+            <w:r>
+              <w:t>) en un firewall.</w:t>
             </w:r>
           </w:p>
         </w:tc>
@@ -78,8 +110,13 @@
           </w:tcPr>
           <w:p>
             <w:r>
-              <w:t>Reemplazar la configuración completa de una interfaz OSPF..</w:t>
-            </w:r>
+              <w:t xml:space="preserve">Reemplazar la configuración completa de una interfaz </w:t>
+            </w:r>
+            <w:proofErr w:type="gramStart"/>
+            <w:r>
+              <w:t>OSPF..</w:t>
+            </w:r>
+            <w:proofErr w:type="gramEnd"/>
           </w:p>
         </w:tc>
         <w:tc>
@@ -87,9 +124,11 @@
             <w:tcW w:w="4414" w:type="dxa"/>
           </w:tcPr>
           <w:p>
+            <w:proofErr w:type="spellStart"/>
             <w:r>
               <w:t>put</w:t>
             </w:r>
+            <w:proofErr w:type="spellEnd"/>
           </w:p>
         </w:tc>
       </w:tr>
@@ -109,9 +148,11 @@
             <w:tcW w:w="4414" w:type="dxa"/>
           </w:tcPr>
           <w:p>
+            <w:proofErr w:type="spellStart"/>
             <w:r>
               <w:t>delete</w:t>
             </w:r>
+            <w:proofErr w:type="spellEnd"/>
           </w:p>
         </w:tc>
       </w:tr>
@@ -131,9 +172,11 @@
             <w:tcW w:w="4414" w:type="dxa"/>
           </w:tcPr>
           <w:p>
+            <w:proofErr w:type="spellStart"/>
             <w:r>
               <w:t>patch</w:t>
             </w:r>
+            <w:proofErr w:type="spellEnd"/>
           </w:p>
         </w:tc>
       </w:tr>
@@ -380,8 +423,21 @@
                 <w:szCs w:val="24"/>
                 <w:lang w:eastAsia="es-MX"/>
               </w:rPr>
-              <w:t>201 Created</w:t>
-            </w:r>
+              <w:t xml:space="preserve">201 </w:t>
+            </w:r>
+            <w:proofErr w:type="spellStart"/>
+            <w:r>
+              <w:rPr>
+                <w:rFonts w:ascii="Times New Roman" w:eastAsia="Times New Roman" w:hAnsi="Times New Roman" w:cs="Times New Roman"/>
+                <w:b/>
+                <w:bCs/>
+                <w:sz w:val="24"/>
+                <w:szCs w:val="24"/>
+                <w:lang w:eastAsia="es-MX"/>
+              </w:rPr>
+              <w:t>Created</w:t>
+            </w:r>
+            <w:proofErr w:type="spellEnd"/>
           </w:p>
         </w:tc>
         <w:tc>
@@ -468,7 +524,31 @@
                 <w:szCs w:val="24"/>
                 <w:lang w:eastAsia="es-MX"/>
               </w:rPr>
-              <w:t>204 No Content</w:t>
+              <w:t xml:space="preserve">204 </w:t>
+            </w:r>
+            <w:proofErr w:type="gramStart"/>
+            <w:r>
+              <w:rPr>
+                <w:rFonts w:ascii="Times New Roman" w:eastAsia="Times New Roman" w:hAnsi="Times New Roman" w:cs="Times New Roman"/>
+                <w:b/>
+                <w:bCs/>
+                <w:sz w:val="24"/>
+                <w:szCs w:val="24"/>
+                <w:lang w:eastAsia="es-MX"/>
+              </w:rPr>
+              <w:t>No</w:t>
+            </w:r>
+            <w:proofErr w:type="gramEnd"/>
+            <w:r>
+              <w:rPr>
+                <w:rFonts w:ascii="Times New Roman" w:eastAsia="Times New Roman" w:hAnsi="Times New Roman" w:cs="Times New Roman"/>
+                <w:b/>
+                <w:bCs/>
+                <w:sz w:val="24"/>
+                <w:szCs w:val="24"/>
+                <w:lang w:eastAsia="es-MX"/>
+              </w:rPr>
+              <w:t xml:space="preserve"> Content</w:t>
             </w:r>
           </w:p>
         </w:tc>
@@ -556,8 +636,45 @@
                 <w:szCs w:val="24"/>
                 <w:lang w:eastAsia="es-MX"/>
               </w:rPr>
-              <w:t>400 Bad Request</w:t>
-            </w:r>
+              <w:t xml:space="preserve">400 </w:t>
+            </w:r>
+            <w:proofErr w:type="spellStart"/>
+            <w:r>
+              <w:rPr>
+                <w:rFonts w:ascii="Times New Roman" w:eastAsia="Times New Roman" w:hAnsi="Times New Roman" w:cs="Times New Roman"/>
+                <w:b/>
+                <w:bCs/>
+                <w:sz w:val="24"/>
+                <w:szCs w:val="24"/>
+                <w:lang w:eastAsia="es-MX"/>
+              </w:rPr>
+              <w:t>Bad</w:t>
+            </w:r>
+            <w:proofErr w:type="spellEnd"/>
+            <w:r>
+              <w:rPr>
+                <w:rFonts w:ascii="Times New Roman" w:eastAsia="Times New Roman" w:hAnsi="Times New Roman" w:cs="Times New Roman"/>
+                <w:b/>
+                <w:bCs/>
+                <w:sz w:val="24"/>
+                <w:szCs w:val="24"/>
+                <w:lang w:eastAsia="es-MX"/>
+              </w:rPr>
+              <w:t xml:space="preserve"> </w:t>
+            </w:r>
+            <w:proofErr w:type="spellStart"/>
+            <w:r>
+              <w:rPr>
+                <w:rFonts w:ascii="Times New Roman" w:eastAsia="Times New Roman" w:hAnsi="Times New Roman" w:cs="Times New Roman"/>
+                <w:b/>
+                <w:bCs/>
+                <w:sz w:val="24"/>
+                <w:szCs w:val="24"/>
+                <w:lang w:eastAsia="es-MX"/>
+              </w:rPr>
+              <w:t>Request</w:t>
+            </w:r>
+            <w:proofErr w:type="spellEnd"/>
           </w:p>
         </w:tc>
         <w:tc>
@@ -644,8 +761,21 @@
                 <w:szCs w:val="24"/>
                 <w:lang w:eastAsia="es-MX"/>
               </w:rPr>
-              <w:t>401 Unauthorized</w:t>
-            </w:r>
+              <w:t xml:space="preserve">401 </w:t>
+            </w:r>
+            <w:proofErr w:type="spellStart"/>
+            <w:r>
+              <w:rPr>
+                <w:rFonts w:ascii="Times New Roman" w:eastAsia="Times New Roman" w:hAnsi="Times New Roman" w:cs="Times New Roman"/>
+                <w:b/>
+                <w:bCs/>
+                <w:sz w:val="24"/>
+                <w:szCs w:val="24"/>
+                <w:lang w:eastAsia="es-MX"/>
+              </w:rPr>
+              <w:t>Unauthorized</w:t>
+            </w:r>
+            <w:proofErr w:type="spellEnd"/>
           </w:p>
         </w:tc>
         <w:tc>
@@ -732,8 +862,21 @@
                 <w:szCs w:val="24"/>
                 <w:lang w:eastAsia="es-MX"/>
               </w:rPr>
-              <w:t>403 Forbidden</w:t>
-            </w:r>
+              <w:t xml:space="preserve">403 </w:t>
+            </w:r>
+            <w:proofErr w:type="spellStart"/>
+            <w:r>
+              <w:rPr>
+                <w:rFonts w:ascii="Times New Roman" w:eastAsia="Times New Roman" w:hAnsi="Times New Roman" w:cs="Times New Roman"/>
+                <w:b/>
+                <w:bCs/>
+                <w:sz w:val="24"/>
+                <w:szCs w:val="24"/>
+                <w:lang w:eastAsia="es-MX"/>
+              </w:rPr>
+              <w:t>Forbidden</w:t>
+            </w:r>
+            <w:proofErr w:type="spellEnd"/>
           </w:p>
         </w:tc>
         <w:tc>
@@ -820,8 +963,45 @@
                 <w:szCs w:val="24"/>
                 <w:lang w:eastAsia="es-MX"/>
               </w:rPr>
-              <w:t>404 Not Found</w:t>
-            </w:r>
+              <w:t xml:space="preserve">404 </w:t>
+            </w:r>
+            <w:proofErr w:type="spellStart"/>
+            <w:r>
+              <w:rPr>
+                <w:rFonts w:ascii="Times New Roman" w:eastAsia="Times New Roman" w:hAnsi="Times New Roman" w:cs="Times New Roman"/>
+                <w:b/>
+                <w:bCs/>
+                <w:sz w:val="24"/>
+                <w:szCs w:val="24"/>
+                <w:lang w:eastAsia="es-MX"/>
+              </w:rPr>
+              <w:t>Not</w:t>
+            </w:r>
+            <w:proofErr w:type="spellEnd"/>
+            <w:r>
+              <w:rPr>
+                <w:rFonts w:ascii="Times New Roman" w:eastAsia="Times New Roman" w:hAnsi="Times New Roman" w:cs="Times New Roman"/>
+                <w:b/>
+                <w:bCs/>
+                <w:sz w:val="24"/>
+                <w:szCs w:val="24"/>
+                <w:lang w:eastAsia="es-MX"/>
+              </w:rPr>
+              <w:t xml:space="preserve"> </w:t>
+            </w:r>
+            <w:proofErr w:type="spellStart"/>
+            <w:r>
+              <w:rPr>
+                <w:rFonts w:ascii="Times New Roman" w:eastAsia="Times New Roman" w:hAnsi="Times New Roman" w:cs="Times New Roman"/>
+                <w:b/>
+                <w:bCs/>
+                <w:sz w:val="24"/>
+                <w:szCs w:val="24"/>
+                <w:lang w:eastAsia="es-MX"/>
+              </w:rPr>
+              <w:t>Found</w:t>
+            </w:r>
+            <w:proofErr w:type="spellEnd"/>
           </w:p>
         </w:tc>
         <w:tc>
@@ -908,8 +1088,21 @@
                 <w:szCs w:val="24"/>
                 <w:lang w:eastAsia="es-MX"/>
               </w:rPr>
-              <w:t>409 Conflict</w:t>
-            </w:r>
+              <w:t xml:space="preserve">409 </w:t>
+            </w:r>
+            <w:proofErr w:type="spellStart"/>
+            <w:r>
+              <w:rPr>
+                <w:rFonts w:ascii="Times New Roman" w:eastAsia="Times New Roman" w:hAnsi="Times New Roman" w:cs="Times New Roman"/>
+                <w:b/>
+                <w:bCs/>
+                <w:sz w:val="24"/>
+                <w:szCs w:val="24"/>
+                <w:lang w:eastAsia="es-MX"/>
+              </w:rPr>
+              <w:t>Conflict</w:t>
+            </w:r>
+            <w:proofErr w:type="spellEnd"/>
           </w:p>
         </w:tc>
         <w:tc>
@@ -996,7 +1189,31 @@
                 <w:szCs w:val="24"/>
                 <w:lang w:eastAsia="es-MX"/>
               </w:rPr>
-              <w:t>500 Internal Server Error</w:t>
+              <w:t xml:space="preserve">500 </w:t>
+            </w:r>
+            <w:proofErr w:type="spellStart"/>
+            <w:r>
+              <w:rPr>
+                <w:rFonts w:ascii="Times New Roman" w:eastAsia="Times New Roman" w:hAnsi="Times New Roman" w:cs="Times New Roman"/>
+                <w:b/>
+                <w:bCs/>
+                <w:sz w:val="24"/>
+                <w:szCs w:val="24"/>
+                <w:lang w:eastAsia="es-MX"/>
+              </w:rPr>
+              <w:t>Internal</w:t>
+            </w:r>
+            <w:proofErr w:type="spellEnd"/>
+            <w:r>
+              <w:rPr>
+                <w:rFonts w:ascii="Times New Roman" w:eastAsia="Times New Roman" w:hAnsi="Times New Roman" w:cs="Times New Roman"/>
+                <w:b/>
+                <w:bCs/>
+                <w:sz w:val="24"/>
+                <w:szCs w:val="24"/>
+                <w:lang w:eastAsia="es-MX"/>
+              </w:rPr>
+              <w:t xml:space="preserve"> Server Error</w:t>
             </w:r>
           </w:p>
         </w:tc>
@@ -1084,8 +1301,45 @@
                 <w:szCs w:val="24"/>
                 <w:lang w:eastAsia="es-MX"/>
               </w:rPr>
-              <w:t>503 Service Unavailable</w:t>
-            </w:r>
+              <w:t xml:space="preserve">503 </w:t>
+            </w:r>
+            <w:proofErr w:type="spellStart"/>
+            <w:r>
+              <w:rPr>
+                <w:rFonts w:ascii="Times New Roman" w:eastAsia="Times New Roman" w:hAnsi="Times New Roman" w:cs="Times New Roman"/>
+                <w:b/>
+                <w:bCs/>
+                <w:sz w:val="24"/>
+                <w:szCs w:val="24"/>
+                <w:lang w:eastAsia="es-MX"/>
+              </w:rPr>
+              <w:t>Service</w:t>
+            </w:r>
+            <w:proofErr w:type="spellEnd"/>
+            <w:r>
+              <w:rPr>
+                <w:rFonts w:ascii="Times New Roman" w:eastAsia="Times New Roman" w:hAnsi="Times New Roman" w:cs="Times New Roman"/>
+                <w:b/>
+                <w:bCs/>
+                <w:sz w:val="24"/>
+                <w:szCs w:val="24"/>
+                <w:lang w:eastAsia="es-MX"/>
+              </w:rPr>
+              <w:t xml:space="preserve"> </w:t>
+            </w:r>
+            <w:proofErr w:type="spellStart"/>
+            <w:r>
+              <w:rPr>
+                <w:rFonts w:ascii="Times New Roman" w:eastAsia="Times New Roman" w:hAnsi="Times New Roman" w:cs="Times New Roman"/>
+                <w:b/>
+                <w:bCs/>
+                <w:sz w:val="24"/>
+                <w:szCs w:val="24"/>
+                <w:lang w:eastAsia="es-MX"/>
+              </w:rPr>
+              <w:t>Unavailable</w:t>
+            </w:r>
+            <w:proofErr w:type="spellEnd"/>
           </w:p>
         </w:tc>
         <w:tc>
@@ -1168,13 +1422,95 @@
     </w:p>
     <w:p>
       <w:r>
-        <w:t>1. Un script intenta consultar el estado de la interfaz GigabitEthernet99 , pero dicha interfaz no</w:t>
-      </w:r>
-      <w:r>
+        <w:t>1. Un script intenta consultar el estado de la interfaz GigabitEthernet</w:t>
+      </w:r>
+      <w:proofErr w:type="gramStart"/>
+      <w:r>
+        <w:t>99 ,</w:t>
+      </w:r>
+      <w:proofErr w:type="gramEnd"/>
+      <w:r>
+        <w:t xml:space="preserve"> pero dicha interfaz no existe físicamente ni lógicamente en el </w:t>
+      </w:r>
+      <w:proofErr w:type="spellStart"/>
+      <w:r>
+        <w:t>router</w:t>
+      </w:r>
+      <w:proofErr w:type="spellEnd"/>
+      <w:r>
+        <w:t>. ¿Qué código devuelve la API?</w:t>
+      </w:r>
+    </w:p>
+    <w:p>
+      <w:r>
+        <w:t>A) 200 OK</w:t>
+      </w:r>
+    </w:p>
+    <w:p>
+      <w:r>
+        <w:rPr>
+          <w:highlight w:val="yellow"/>
+        </w:rPr>
+        <w:t xml:space="preserve">B) 404 </w:t>
+      </w:r>
+      <w:proofErr w:type="spellStart"/>
+      <w:r>
+        <w:rPr>
+          <w:highlight w:val="yellow"/>
+        </w:rPr>
+        <w:t>Not</w:t>
+      </w:r>
+      <w:proofErr w:type="spellEnd"/>
+      <w:r>
+        <w:rPr>
+          <w:highlight w:val="yellow"/>
+        </w:rPr>
         <w:t xml:space="preserve"> </w:t>
       </w:r>
-      <w:r>
-        <w:t>existe físicamente ni lógicamente en el router. ¿Qué código devuelve la API?</w:t>
+      <w:proofErr w:type="spellStart"/>
+      <w:r>
+        <w:rPr>
+          <w:highlight w:val="yellow"/>
+        </w:rPr>
+        <w:t>Found</w:t>
+      </w:r>
+      <w:proofErr w:type="spellEnd"/>
+    </w:p>
+    <w:p>
+      <w:r>
+        <w:t xml:space="preserve">C) 500 </w:t>
+      </w:r>
+      <w:proofErr w:type="spellStart"/>
+      <w:r>
+        <w:t>Internal</w:t>
+      </w:r>
+      <w:proofErr w:type="spellEnd"/>
+      <w:r>
+        <w:t xml:space="preserve"> Server Error</w:t>
+      </w:r>
+    </w:p>
+    <w:p>
+      <w:r>
+        <w:t xml:space="preserve">D) 201 </w:t>
+      </w:r>
+      <w:proofErr w:type="spellStart"/>
+      <w:r>
+        <w:t>Created</w:t>
+      </w:r>
+      <w:proofErr w:type="spellEnd"/>
+    </w:p>
+    <w:p/>
+    <w:p>
+      <w:r>
+        <w:t xml:space="preserve">2. Se envía una petición POST para configurar un nuevo túnel VPN, pero el token de autenticación en el encabezado </w:t>
+      </w:r>
+      <w:proofErr w:type="spellStart"/>
+      <w:r>
+        <w:t>Authorization</w:t>
+      </w:r>
+      <w:proofErr w:type="spellEnd"/>
+      <w:r>
+        <w:t xml:space="preserve"> ha expirado o es inválido.</w:t>
       </w:r>
     </w:p>
     <w:p>
@@ -1185,9 +1521,10 @@
       </w:pPr>
       <w:r>
         <w:rPr>
+          <w:highlight w:val="yellow"/>
           <w:lang w:val="en-US"/>
         </w:rPr>
-        <w:t>A) 200 OK</w:t>
+        <w:t>A) 401 Unauthorized</w:t>
       </w:r>
     </w:p>
     <w:p>
@@ -1198,10 +1535,9 @@
       </w:pPr>
       <w:r>
         <w:rPr>
-          <w:highlight w:val="yellow"/>
           <w:lang w:val="en-US"/>
         </w:rPr>
-        <w:t>B) 404 Not Found</w:t>
+        <w:t>B) 204 No Content</w:t>
       </w:r>
     </w:p>
     <w:p>
@@ -1214,102 +1550,136 @@
         <w:rPr>
           <w:lang w:val="en-US"/>
         </w:rPr>
-        <w:t>C) 500 Internal Server Error</w:t>
+        <w:t>C) 400 Bad Request</w:t>
       </w:r>
     </w:p>
     <w:p>
       <w:r>
-        <w:t>D) 201 Created</w:t>
+        <w:t>Parte 3: Diagnóstico y Justificación</w:t>
+      </w:r>
+    </w:p>
+    <w:p>
+      <w:r>
+        <w:t xml:space="preserve">3. Un administrador de red intenta actualizar la IP de un servidor mediante un método </w:t>
+      </w:r>
+      <w:proofErr w:type="gramStart"/>
+      <w:r>
+        <w:t>PUT .</w:t>
+      </w:r>
+      <w:proofErr w:type="gramEnd"/>
+      <w:r>
+        <w:t xml:space="preserve"> La API responde con un código 400 </w:t>
+      </w:r>
+      <w:proofErr w:type="spellStart"/>
+      <w:r>
+        <w:t>Bad</w:t>
+      </w:r>
+      <w:proofErr w:type="spellEnd"/>
+      <w:r>
+        <w:t xml:space="preserve"> </w:t>
+      </w:r>
+      <w:proofErr w:type="spellStart"/>
+      <w:r>
+        <w:t>Request</w:t>
+      </w:r>
+      <w:proofErr w:type="spellEnd"/>
+      <w:r>
+        <w:t>. Explica dos posibles razones técnicas relacionadas con la estructura de la petición (</w:t>
+      </w:r>
+      <w:proofErr w:type="spellStart"/>
+      <w:r>
+        <w:t>payload</w:t>
+      </w:r>
+      <w:proofErr w:type="spellEnd"/>
+      <w:r>
+        <w:t>) que podrían causar este error específico.</w:t>
+      </w:r>
+    </w:p>
+    <w:p>
+      <w:r>
+        <w:t xml:space="preserve">El </w:t>
+      </w:r>
+      <w:proofErr w:type="spellStart"/>
+      <w:r>
+        <w:t>payload</w:t>
+      </w:r>
+      <w:proofErr w:type="spellEnd"/>
+      <w:r>
+        <w:t xml:space="preserve"> puede ser incorrecto o le puede faltar algún campo requerido</w:t>
       </w:r>
     </w:p>
     <w:p/>
     <w:p>
       <w:r>
-        <w:t>2. Se envía una petición POST para configurar un nuevo túnel VPN, pero el token de autenticación</w:t>
-      </w:r>
-      <w:r>
-        <w:t xml:space="preserve"> </w:t>
-      </w:r>
-      <w:r>
-        <w:t>en el encabezado Authorization ha expirado o es inválido.</w:t>
+        <w:t>4. ¿Cuál es la diferencia principal entre el uso de POST y PUT al configurar una interfaz de red, considerando la propiedad de idempotencia?</w:t>
       </w:r>
     </w:p>
     <w:p>
-      <w:pPr>
-        <w:rPr>
-          <w:lang w:val="en-US"/>
-        </w:rPr>
-      </w:pPr>
-      <w:r>
-        <w:rPr>
-          <w:highlight w:val="yellow"/>
-          <w:lang w:val="en-US"/>
-        </w:rPr>
-        <w:t>A) 401 Unauthorized</w:t>
+      <w:r>
+        <w:t xml:space="preserve">Que el </w:t>
+      </w:r>
+      <w:proofErr w:type="spellStart"/>
+      <w:r>
+        <w:t>put</w:t>
+      </w:r>
+      <w:proofErr w:type="spellEnd"/>
+      <w:r>
+        <w:t xml:space="preserve"> es idempotente y </w:t>
+      </w:r>
+      <w:proofErr w:type="gramStart"/>
+      <w:r>
+        <w:t>post  no</w:t>
+      </w:r>
+      <w:proofErr w:type="gramEnd"/>
+    </w:p>
+    <w:p/>
+    <w:p/>
+    <w:p/>
+    <w:p/>
+    <w:p/>
+    <w:p>
+      <w:r>
+        <w:lastRenderedPageBreak/>
+        <w:t>POSTMAN</w:t>
       </w:r>
     </w:p>
     <w:p>
-      <w:pPr>
-        <w:rPr>
-          <w:lang w:val="en-US"/>
-        </w:rPr>
-      </w:pPr>
-      <w:r>
-        <w:rPr>
-          <w:lang w:val="en-US"/>
-        </w:rPr>
-        <w:t>B) 204 No Content</w:t>
-      </w:r>
-    </w:p>
-    <w:p>
-      <w:pPr>
-        <w:rPr>
-          <w:lang w:val="en-US"/>
-        </w:rPr>
-      </w:pPr>
-      <w:r>
-        <w:rPr>
-          <w:lang w:val="en-US"/>
-        </w:rPr>
-        <w:t>C) 400 Bad Request</w:t>
-      </w:r>
-    </w:p>
-    <w:p>
-      <w:r>
-        <w:t>Parte 3: Diagnóstico y Justificación</w:t>
-      </w:r>
-    </w:p>
-    <w:p>
-      <w:r>
-        <w:t>3. Un administrador de red intenta actualizar la IP de un servidor mediante un método PUT . La</w:t>
-      </w:r>
-      <w:r>
-        <w:t xml:space="preserve"> </w:t>
-      </w:r>
-      <w:r>
-        <w:t>API responde con un código 400 Bad Request. Explica dos posibles razones técnicas</w:t>
-      </w:r>
-      <w:r>
-        <w:t xml:space="preserve"> </w:t>
-      </w:r>
-      <w:r>
-        <w:t>relacionadas con la estructura de la petición (payload) que podrían causar este error específico.</w:t>
-      </w:r>
-    </w:p>
-    <w:p>
-      <w:r>
-        <w:t>El payload puede ser incorrecto o le puede faltar algún campo requerido</w:t>
-      </w:r>
-    </w:p>
-    <w:p/>
-    <w:p>
-      <w:r>
-        <w:t>4. ¿Cuál es la diferencia principal entre el uso de POST y PUT al configurar una interfaz de red, considerando la propiedad de idempotencia?</w:t>
-      </w:r>
-    </w:p>
-    <w:p>
-      <w:r>
-        <w:t>Que el put es idempotente y post  no</w:t>
+      <w:r>
+        <w:drawing>
+          <wp:inline distT="0" distB="0" distL="0" distR="0" wp14:anchorId="43CDEAA9" wp14:editId="6E5C83A9">
+            <wp:extent cx="5612130" cy="3456305"/>
+            <wp:effectExtent l="0" t="0" r="7620" b="0"/>
+            <wp:docPr id="1" name="Imagen 1"/>
+            <wp:cNvGraphicFramePr>
+              <a:graphicFrameLocks xmlns:a="http://schemas.openxmlformats.org/drawingml/2006/main" noChangeAspect="1"/>
+            </wp:cNvGraphicFramePr>
+            <a:graphic xmlns:a="http://schemas.openxmlformats.org/drawingml/2006/main">
+              <a:graphicData uri="http://schemas.openxmlformats.org/drawingml/2006/picture">
+                <pic:pic xmlns:pic="http://schemas.openxmlformats.org/drawingml/2006/picture">
+                  <pic:nvPicPr>
+                    <pic:cNvPr id="1" name=""/>
+                    <pic:cNvPicPr/>
+                  </pic:nvPicPr>
+                  <pic:blipFill>
+                    <a:blip r:embed="rId4"/>
+                    <a:stretch>
+                      <a:fillRect/>
+                    </a:stretch>
+                  </pic:blipFill>
+                  <pic:spPr>
+                    <a:xfrm>
+                      <a:off x="0" y="0"/>
+                      <a:ext cx="5612130" cy="3456305"/>
+                    </a:xfrm>
+                    <a:prstGeom prst="rect">
+                      <a:avLst/>
+                    </a:prstGeom>
+                  </pic:spPr>
+                </pic:pic>
+              </a:graphicData>
+            </a:graphic>
+          </wp:inline>
+        </w:drawing>
       </w:r>
     </w:p>
     <w:p/>

</xml_diff>